<commit_message>
Avancement sprint 3: ajout de la section profile ainsi que du chatbot capable de text to sql
git commit --amend --reset-author#	new file:   code/frontend/src/pages/Client/ClientProfile.tsx
</commit_message>
<xml_diff>
--- a/docs/sprint2.docx
+++ b/docs/sprint2.docx
@@ -229,12 +229,21 @@
         </w:rPr>
         <w:t xml:space="preserve"> </w:t>
       </w:r>
+      <w:proofErr w:type="spellStart"/>
       <w:r>
         <w:rPr>
           <w:spacing w:val="-4"/>
           <w:sz w:val="28"/>
         </w:rPr>
-        <w:t>FitnessBro- Plateforme de gestion de programme fitness</w:t>
+        <w:t>FitnessBro</w:t>
+      </w:r>
+      <w:proofErr w:type="spellEnd"/>
+      <w:r>
+        <w:rPr>
+          <w:spacing w:val="-4"/>
+          <w:sz w:val="28"/>
+        </w:rPr>
+        <w:t>- Plateforme de gestion de programme fitness</w:t>
       </w:r>
     </w:p>
     <w:p>
@@ -380,8 +389,17 @@
           <w:w w:val="85"/>
           <w:sz w:val="28"/>
         </w:rPr>
-        <w:t xml:space="preserve"> Novembre</w:t>
-      </w:r>
+        <w:t xml:space="preserve"> </w:t>
+      </w:r>
+      <w:proofErr w:type="gramStart"/>
+      <w:r>
+        <w:rPr>
+          <w:w w:val="85"/>
+          <w:sz w:val="28"/>
+        </w:rPr>
+        <w:t>Novembre</w:t>
+      </w:r>
+      <w:proofErr w:type="gramEnd"/>
       <w:r>
         <w:rPr>
           <w:spacing w:val="4"/>
@@ -413,6 +431,7 @@
           <w:lang w:val="en-US"/>
         </w:rPr>
       </w:pPr>
+      <w:proofErr w:type="gramStart"/>
       <w:r>
         <w:rPr>
           <w:b/>
@@ -440,6 +459,7 @@
         </w:rPr>
         <w:t>:</w:t>
       </w:r>
+      <w:proofErr w:type="gramEnd"/>
       <w:r>
         <w:rPr>
           <w:b/>
@@ -575,8 +595,16 @@
         <w:rPr>
           <w:sz w:val="28"/>
         </w:rPr>
-        <w:t>Ilias Essajai</w:t>
-      </w:r>
+        <w:t xml:space="preserve">Ilias </w:t>
+      </w:r>
+      <w:proofErr w:type="spellStart"/>
+      <w:r>
+        <w:rPr>
+          <w:sz w:val="28"/>
+        </w:rPr>
+        <w:t>Essajai</w:t>
+      </w:r>
+      <w:proofErr w:type="spellEnd"/>
     </w:p>
     <w:p>
       <w:pPr>
@@ -599,8 +627,17 @@
           <w:spacing w:val="-4"/>
           <w:sz w:val="28"/>
         </w:rPr>
-        <w:t>Fahd El Guandafi</w:t>
-      </w:r>
+        <w:t xml:space="preserve">Fahd El </w:t>
+      </w:r>
+      <w:proofErr w:type="spellStart"/>
+      <w:r>
+        <w:rPr>
+          <w:spacing w:val="-4"/>
+          <w:sz w:val="28"/>
+        </w:rPr>
+        <w:t>Guandafi</w:t>
+      </w:r>
+      <w:proofErr w:type="spellEnd"/>
     </w:p>
     <w:p>
       <w:pPr>
@@ -1018,7 +1055,23 @@
           <w:b/>
           <w:spacing w:val="-8"/>
         </w:rPr>
-        <w:t xml:space="preserve"> React.js + TypeScript + Vite</w:t>
+        <w:t xml:space="preserve"> React.js + </w:t>
+      </w:r>
+      <w:proofErr w:type="spellStart"/>
+      <w:r>
+        <w:rPr>
+          <w:b/>
+          <w:spacing w:val="-8"/>
+        </w:rPr>
+        <w:t>TypeScript</w:t>
+      </w:r>
+      <w:proofErr w:type="spellEnd"/>
+      <w:r>
+        <w:rPr>
+          <w:b/>
+          <w:spacing w:val="-8"/>
+        </w:rPr>
+        <w:t xml:space="preserve"> + Vite</w:t>
       </w:r>
     </w:p>
     <w:p>
@@ -1034,6 +1087,7 @@
           <w:lang w:val="en-US"/>
         </w:rPr>
       </w:pPr>
+      <w:proofErr w:type="gramStart"/>
       <w:r>
         <w:rPr>
           <w:b/>
@@ -1043,6 +1097,7 @@
         </w:rPr>
         <w:t>Backend :</w:t>
       </w:r>
+      <w:proofErr w:type="gramEnd"/>
       <w:r>
         <w:rPr>
           <w:b/>
@@ -1065,7 +1120,25 @@
           <w:spacing w:val="-8"/>
           <w:lang w:val="en-US"/>
         </w:rPr>
-        <w:t xml:space="preserve"> FastAPI (Auth-Service, Program-Service, Tracking-Service)</w:t>
+        <w:t xml:space="preserve"> </w:t>
+      </w:r>
+      <w:proofErr w:type="spellStart"/>
+      <w:r>
+        <w:rPr>
+          <w:b/>
+          <w:spacing w:val="-8"/>
+          <w:lang w:val="en-US"/>
+        </w:rPr>
+        <w:t>FastAPI</w:t>
+      </w:r>
+      <w:proofErr w:type="spellEnd"/>
+      <w:r>
+        <w:rPr>
+          <w:b/>
+          <w:spacing w:val="-8"/>
+          <w:lang w:val="en-US"/>
+        </w:rPr>
+        <w:t xml:space="preserve"> (Auth-Service, Program-Service, Tracking-Service)</w:t>
       </w:r>
     </w:p>
     <w:p>
@@ -1109,6 +1182,8 @@
           <w:lang w:val="en-US"/>
         </w:rPr>
       </w:pPr>
+      <w:proofErr w:type="spellStart"/>
+      <w:proofErr w:type="gramStart"/>
       <w:r>
         <w:rPr>
           <w:b/>
@@ -1116,8 +1191,19 @@
           <w:spacing w:val="-8"/>
           <w:lang w:val="en-US"/>
         </w:rPr>
-        <w:t>Authentification :</w:t>
-      </w:r>
+        <w:t>Authentification</w:t>
+      </w:r>
+      <w:proofErr w:type="spellEnd"/>
+      <w:r>
+        <w:rPr>
+          <w:b/>
+          <w:bCs/>
+          <w:spacing w:val="-8"/>
+          <w:lang w:val="en-US"/>
+        </w:rPr>
+        <w:t xml:space="preserve"> :</w:t>
+      </w:r>
+      <w:proofErr w:type="gramEnd"/>
       <w:r>
         <w:rPr>
           <w:b/>
@@ -1250,7 +1336,14 @@
         <w:rPr>
           <w:spacing w:val="-12"/>
         </w:rPr>
-        <w:t>(Sprint1)</w:t>
+        <w:t>(Sprint1</w:t>
+      </w:r>
+      <w:proofErr w:type="gramStart"/>
+      <w:r>
+        <w:rPr>
+          <w:spacing w:val="-12"/>
+        </w:rPr>
+        <w:t>)</w:t>
       </w:r>
       <w:r>
         <w:rPr>
@@ -1258,6 +1351,7 @@
         </w:rPr>
         <w:t>:</w:t>
       </w:r>
+      <w:proofErr w:type="gramEnd"/>
     </w:p>
     <w:p>
       <w:pPr>
@@ -1437,7 +1531,13 @@
         </w:numPr>
       </w:pPr>
       <w:r>
-        <w:t>Ajout d’exercices par jour avec nombre de séries, répétitions et poids utilisé.</w:t>
+        <w:t xml:space="preserve">Ajout d’exercices par jour avec nombre de séries, répétitions et </w:t>
+      </w:r>
+      <w:r>
+        <w:t xml:space="preserve">suivi du </w:t>
+      </w:r>
+      <w:r>
+        <w:t>poids utilisé.</w:t>
       </w:r>
     </w:p>
     <w:p>
@@ -1549,7 +1649,23 @@
           <w:b/>
           <w:bCs/>
         </w:rPr>
-        <w:t> Vidéos d’exercices dans le dashboard client :</w:t>
+        <w:t xml:space="preserve"> Vidéos d’exercices dans le </w:t>
+      </w:r>
+      <w:proofErr w:type="spellStart"/>
+      <w:r>
+        <w:rPr>
+          <w:b/>
+          <w:bCs/>
+        </w:rPr>
+        <w:t>dashboard</w:t>
+      </w:r>
+      <w:proofErr w:type="spellEnd"/>
+      <w:r>
+        <w:rPr>
+          <w:b/>
+          <w:bCs/>
+        </w:rPr>
+        <w:t xml:space="preserve"> client :</w:t>
       </w:r>
     </w:p>
     <w:p>
@@ -1787,6 +1903,7 @@
         <w:spacing w:before="80"/>
         <w:ind w:left="381" w:hanging="381"/>
       </w:pPr>
+      <w:proofErr w:type="spellStart"/>
       <w:r>
         <w:rPr>
           <w:color w:val="0D465F"/>
@@ -1795,6 +1912,7 @@
         <w:lastRenderedPageBreak/>
         <w:t>Personas</w:t>
       </w:r>
+      <w:proofErr w:type="spellEnd"/>
       <w:r>
         <w:rPr>
           <w:color w:val="0D465F"/>
@@ -1854,12 +1972,14 @@
         </w:rPr>
         <w:t xml:space="preserve">Persona </w:t>
       </w:r>
+      <w:proofErr w:type="spellStart"/>
       <w:r>
         <w:rPr>
           <w:spacing w:val="-4"/>
         </w:rPr>
         <w:t>Persona</w:t>
       </w:r>
+      <w:proofErr w:type="spellEnd"/>
       <w:r>
         <w:rPr>
           <w:spacing w:val="-31"/>
@@ -2124,8 +2244,13 @@
         <w:spacing w:before="163" w:line="388" w:lineRule="auto"/>
         <w:ind w:right="3986"/>
       </w:pPr>
-      <w:r>
-        <w:t>Creation de Programme :</w:t>
+      <w:proofErr w:type="spellStart"/>
+      <w:r>
+        <w:t>Creation</w:t>
+      </w:r>
+      <w:proofErr w:type="spellEnd"/>
+      <w:r>
+        <w:t xml:space="preserve"> de Programme :</w:t>
       </w:r>
     </w:p>
     <w:p>
@@ -2239,7 +2364,21 @@
         <w:rPr>
           <w:spacing w:val="-4"/>
         </w:rPr>
-        <w:t xml:space="preserve">(avec les exercices et le nombre de series et de répétitions) </w:t>
+        <w:t xml:space="preserve">(avec les exercices et le nombre de </w:t>
+      </w:r>
+      <w:proofErr w:type="spellStart"/>
+      <w:r>
+        <w:rPr>
+          <w:spacing w:val="-4"/>
+        </w:rPr>
+        <w:t>series</w:t>
+      </w:r>
+      <w:proofErr w:type="spellEnd"/>
+      <w:r>
+        <w:rPr>
+          <w:spacing w:val="-4"/>
+        </w:rPr>
+        <w:t xml:space="preserve"> et de répétitions) </w:t>
       </w:r>
       <w:r>
         <w:rPr>
@@ -2671,8 +2810,16 @@
         <w:rPr>
           <w:spacing w:val="-4"/>
         </w:rPr>
-        <w:t>Elle peut voir le programme de ce jour sur son main dashboard</w:t>
-      </w:r>
+        <w:t xml:space="preserve">Elle peut voir le programme de ce jour sur son main </w:t>
+      </w:r>
+      <w:proofErr w:type="spellStart"/>
+      <w:r>
+        <w:rPr>
+          <w:spacing w:val="-4"/>
+        </w:rPr>
+        <w:t>dashboard</w:t>
+      </w:r>
+      <w:proofErr w:type="spellEnd"/>
     </w:p>
     <w:p>
       <w:pPr>
@@ -2775,8 +2922,16 @@
         <w:rPr>
           <w:spacing w:val="-4"/>
         </w:rPr>
-        <w:t>Elle peut télécharger le bilan en version pdf</w:t>
-      </w:r>
+        <w:t xml:space="preserve">Elle peut télécharger le bilan en version </w:t>
+      </w:r>
+      <w:proofErr w:type="spellStart"/>
+      <w:r>
+        <w:rPr>
+          <w:spacing w:val="-4"/>
+        </w:rPr>
+        <w:t>pdf</w:t>
+      </w:r>
+      <w:proofErr w:type="spellEnd"/>
     </w:p>
     <w:p>
       <w:pPr>
@@ -2826,8 +2981,17 @@
           <w:color w:val="0D465F"/>
           <w:w w:val="85"/>
         </w:rPr>
-        <w:t>(Backlog</w:t>
-      </w:r>
+        <w:t>(</w:t>
+      </w:r>
+      <w:proofErr w:type="spellStart"/>
+      <w:r>
+        <w:rPr>
+          <w:color w:val="0D465F"/>
+          <w:w w:val="85"/>
+        </w:rPr>
+        <w:t>Backlog</w:t>
+      </w:r>
+      <w:proofErr w:type="spellEnd"/>
       <w:r>
         <w:rPr>
           <w:color w:val="0D465F"/>
@@ -3133,7 +3297,15 @@
               </w:rPr>
             </w:pPr>
             <w:r>
-              <w:t>Le formulaire d'entraînement permet d’ajouter un ou plusieurs exercices avec les champs : nom, séries, reps, poids.</w:t>
+              <w:t xml:space="preserve">Le formulaire d'entraînement permet d’ajouter un ou plusieurs exercices avec les champs : nom, séries, </w:t>
+            </w:r>
+            <w:proofErr w:type="spellStart"/>
+            <w:r>
+              <w:t>reps</w:t>
+            </w:r>
+            <w:proofErr w:type="spellEnd"/>
+            <w:r>
+              <w:t>, poids.</w:t>
             </w:r>
           </w:p>
         </w:tc>
@@ -3281,14 +3453,27 @@
             <w:r>
               <w:t>Lors de la création ou modification d’un exercice, une requête automatique à YouTube Data API génère une vidéo associée (</w:t>
             </w:r>
+            <w:proofErr w:type="spellStart"/>
             <w:r>
               <w:rPr>
                 <w:rStyle w:val="HTMLCode"/>
               </w:rPr>
-              <w:t>video_url</w:t>
-            </w:r>
-            <w:r>
-              <w:t xml:space="preserve"> rempli automatiquement).</w:t>
+              <w:t>video_</w:t>
+            </w:r>
+            <w:proofErr w:type="gramStart"/>
+            <w:r>
+              <w:rPr>
+                <w:rStyle w:val="HTMLCode"/>
+              </w:rPr>
+              <w:t>url</w:t>
+            </w:r>
+            <w:proofErr w:type="spellEnd"/>
+            <w:r>
+              <w:t xml:space="preserve"> rempli</w:t>
+            </w:r>
+            <w:proofErr w:type="gramEnd"/>
+            <w:r>
+              <w:t xml:space="preserve"> automatiquement).</w:t>
             </w:r>
           </w:p>
         </w:tc>
@@ -3563,7 +3748,15 @@
               </w:rPr>
             </w:pPr>
             <w:r>
-              <w:t>Les cases cochées sont enregistrées dans tracking-service via une API dédiée.</w:t>
+              <w:t xml:space="preserve">Les cases cochées sont enregistrées dans </w:t>
+            </w:r>
+            <w:proofErr w:type="spellStart"/>
+            <w:r>
+              <w:t>tracking</w:t>
+            </w:r>
+            <w:proofErr w:type="spellEnd"/>
+            <w:r>
+              <w:t>-service via une API dédiée.</w:t>
             </w:r>
           </w:p>
         </w:tc>
@@ -3700,13 +3893,35 @@
               </w:rPr>
             </w:pPr>
             <w:r>
-              <w:t xml:space="preserve">Affichage du pourcentage de conformité dans l’UI client + endpoint </w:t>
+              <w:t xml:space="preserve">Affichage du pourcentage de conformité dans l’UI client + </w:t>
+            </w:r>
+            <w:proofErr w:type="spellStart"/>
+            <w:r>
+              <w:t>endpoint</w:t>
+            </w:r>
+            <w:proofErr w:type="spellEnd"/>
+            <w:r>
+              <w:t xml:space="preserve"> </w:t>
             </w:r>
             <w:r>
               <w:rPr>
                 <w:rStyle w:val="HTMLCode"/>
               </w:rPr>
-              <w:t>/tracking/compliance/{id}</w:t>
+              <w:t>/</w:t>
+            </w:r>
+            <w:proofErr w:type="spellStart"/>
+            <w:r>
+              <w:rPr>
+                <w:rStyle w:val="HTMLCode"/>
+              </w:rPr>
+              <w:t>tracking</w:t>
+            </w:r>
+            <w:proofErr w:type="spellEnd"/>
+            <w:r>
+              <w:rPr>
+                <w:rStyle w:val="HTMLCode"/>
+              </w:rPr>
+              <w:t>/compliance/{id}</w:t>
             </w:r>
             <w:r>
               <w:t xml:space="preserve"> disponible.</w:t>
@@ -3846,7 +4061,15 @@
               </w:rPr>
             </w:pPr>
             <w:r>
-              <w:t>Le client saisit le poids utilisé → données sauvegardées via tracking-service.</w:t>
+              <w:t xml:space="preserve">Le client saisit le poids utilisé → données sauvegardées via </w:t>
+            </w:r>
+            <w:proofErr w:type="spellStart"/>
+            <w:r>
+              <w:t>tracking</w:t>
+            </w:r>
+            <w:proofErr w:type="spellEnd"/>
+            <w:r>
+              <w:t>-service.</w:t>
             </w:r>
           </w:p>
         </w:tc>
@@ -4120,7 +4343,15 @@
               </w:rPr>
             </w:pPr>
             <w:r>
-              <w:t>Génération PDF via backend (ReportLab) incluant conformité, repas, exercices, charges, résumé.</w:t>
+              <w:t>Génération PDF via backend (</w:t>
+            </w:r>
+            <w:proofErr w:type="spellStart"/>
+            <w:r>
+              <w:t>ReportLab</w:t>
+            </w:r>
+            <w:proofErr w:type="spellEnd"/>
+            <w:r>
+              <w:t>) incluant conformité, repas, exercices, charges, résumé.</w:t>
             </w:r>
           </w:p>
         </w:tc>
@@ -4208,7 +4439,15 @@
               </w:rPr>
             </w:pPr>
             <w:r>
-              <w:t>En tant que système, j’enregistre les exercices détaillés (nom, séries, reps, poids, vidéo) en JSONB dans PostgreSQL.</w:t>
+              <w:t xml:space="preserve">En tant que système, j’enregistre les exercices détaillés (nom, séries, </w:t>
+            </w:r>
+            <w:proofErr w:type="spellStart"/>
+            <w:r>
+              <w:t>reps</w:t>
+            </w:r>
+            <w:proofErr w:type="spellEnd"/>
+            <w:r>
+              <w:t>, poids, vidéo) en JSONB dans PostgreSQL.</w:t>
             </w:r>
           </w:p>
         </w:tc>
@@ -4404,8 +4643,13 @@
                 <w:sz w:val="24"/>
               </w:rPr>
             </w:pPr>
-            <w:r>
-              <w:t>Endpoints existants modifiés sans casser l’ancien comportement.</w:t>
+            <w:proofErr w:type="spellStart"/>
+            <w:r>
+              <w:t>Endpoints</w:t>
+            </w:r>
+            <w:proofErr w:type="spellEnd"/>
+            <w:r>
+              <w:t xml:space="preserve"> existants modifiés sans casser l’ancien comportement.</w:t>
             </w:r>
           </w:p>
         </w:tc>
@@ -4492,7 +4736,15 @@
               </w:rPr>
             </w:pPr>
             <w:r>
-              <w:t>En tant que système, je mets à jour Tracking-Service pour gérer les cases cochées, les poids et le taux de conformité.</w:t>
+              <w:t xml:space="preserve">En tant que système, je mets à jour </w:t>
+            </w:r>
+            <w:proofErr w:type="spellStart"/>
+            <w:r>
+              <w:t>Tracking</w:t>
+            </w:r>
+            <w:proofErr w:type="spellEnd"/>
+            <w:r>
+              <w:t>-Service pour gérer les cases cochées, les poids et le taux de conformité.</w:t>
             </w:r>
           </w:p>
         </w:tc>
@@ -4542,7 +4794,31 @@
               </w:rPr>
             </w:pPr>
             <w:r>
-              <w:t>Nouvelles routes pour update tracking, conformity, weights.</w:t>
+              <w:t xml:space="preserve">Nouvelles routes pour update </w:t>
+            </w:r>
+            <w:proofErr w:type="spellStart"/>
+            <w:r>
+              <w:t>tracking</w:t>
+            </w:r>
+            <w:proofErr w:type="spellEnd"/>
+            <w:r>
+              <w:t xml:space="preserve">, </w:t>
+            </w:r>
+            <w:proofErr w:type="spellStart"/>
+            <w:r>
+              <w:t>conformity</w:t>
+            </w:r>
+            <w:proofErr w:type="spellEnd"/>
+            <w:r>
+              <w:t xml:space="preserve">, </w:t>
+            </w:r>
+            <w:proofErr w:type="spellStart"/>
+            <w:r>
+              <w:t>weights</w:t>
+            </w:r>
+            <w:proofErr w:type="spellEnd"/>
+            <w:r>
+              <w:t>.</w:t>
             </w:r>
           </w:p>
         </w:tc>
@@ -5342,11 +5618,10 @@
           <w:noProof/>
           <w:sz w:val="18"/>
         </w:rPr>
-        <w:lastRenderedPageBreak/>
         <w:drawing>
-          <wp:inline distT="0" distB="0" distL="0" distR="0" wp14:anchorId="6748653F" wp14:editId="2AFC8C2C">
-            <wp:extent cx="4974590" cy="9017000"/>
-            <wp:effectExtent l="0" t="0" r="0" b="0"/>
+          <wp:inline distT="0" distB="0" distL="0" distR="0" wp14:anchorId="6748653F" wp14:editId="17D7F18E">
+            <wp:extent cx="4674287" cy="8472668"/>
+            <wp:effectExtent l="0" t="0" r="0" b="5080"/>
             <wp:docPr id="1086371249" name="Picture 8" descr="A diagram of a program&#10;&#10;AI-generated content may be incorrect."/>
             <wp:cNvGraphicFramePr>
               <a:graphicFrameLocks xmlns:a="http://schemas.openxmlformats.org/drawingml/2006/main" noChangeAspect="1"/>
@@ -5376,7 +5651,7 @@
                   <pic:spPr bwMode="auto">
                     <a:xfrm>
                       <a:off x="0" y="0"/>
-                      <a:ext cx="4974590" cy="9017000"/>
+                      <a:ext cx="4677740" cy="8478927"/>
                     </a:xfrm>
                     <a:prstGeom prst="rect">
                       <a:avLst/>
@@ -5652,7 +5927,15 @@
               </w:rPr>
             </w:pPr>
             <w:r>
-              <w:t>1. Connexion validée via Auth-Service. Rôle “Coach” actif. Client existant dans la base</w:t>
+              <w:t xml:space="preserve">1. Connexion validée via </w:t>
+            </w:r>
+            <w:proofErr w:type="spellStart"/>
+            <w:r>
+              <w:t>Auth</w:t>
+            </w:r>
+            <w:proofErr w:type="spellEnd"/>
+            <w:r>
+              <w:t>-Service. Rôle “Coach” actif. Client existant dans la base</w:t>
             </w:r>
           </w:p>
         </w:tc>
@@ -5944,7 +6227,23 @@
               </w:rPr>
             </w:pPr>
             <w:r>
-              <w:t>- Champs invalides ou manquants- Erreur serveur (500)- Token JWT expiré</w:t>
+              <w:t>- Champs invalides ou manquants- Erreur serveur (</w:t>
+            </w:r>
+            <w:proofErr w:type="gramStart"/>
+            <w:r>
+              <w:t>500)-</w:t>
+            </w:r>
+            <w:proofErr w:type="gramEnd"/>
+            <w:r>
+              <w:t xml:space="preserve"> </w:t>
+            </w:r>
+            <w:proofErr w:type="spellStart"/>
+            <w:r>
+              <w:t>Token</w:t>
+            </w:r>
+            <w:proofErr w:type="spellEnd"/>
+            <w:r>
+              <w:t xml:space="preserve"> JWT expiré</w:t>
             </w:r>
           </w:p>
         </w:tc>
@@ -6250,7 +6549,15 @@
               </w:rPr>
             </w:pPr>
             <w:r>
-              <w:t>Authentifie les utilisateurs et leur attribue un token JWT permettant d’accéder à leurs fonctionnalités.</w:t>
+              <w:t xml:space="preserve">Authentifie les utilisateurs et leur attribue un </w:t>
+            </w:r>
+            <w:proofErr w:type="spellStart"/>
+            <w:r>
+              <w:t>token</w:t>
+            </w:r>
+            <w:proofErr w:type="spellEnd"/>
+            <w:r>
+              <w:t xml:space="preserve"> JWT permettant d’accéder à leurs fonctionnalités.</w:t>
             </w:r>
           </w:p>
         </w:tc>
@@ -6366,7 +6673,23 @@
               </w:rPr>
             </w:pPr>
             <w:r>
-              <w:t>1. L’utilisateur est inscrit dans la base2. Le mot de passe est haché (bcrypt)3. L’Auth-Service est en ligne</w:t>
+              <w:t>1. L’utilisateur est inscrit dans la base2. Le mot de passe est haché (</w:t>
+            </w:r>
+            <w:proofErr w:type="spellStart"/>
+            <w:r>
+              <w:t>bcrypt</w:t>
+            </w:r>
+            <w:proofErr w:type="spellEnd"/>
+            <w:r>
+              <w:t>)3. L’</w:t>
+            </w:r>
+            <w:proofErr w:type="spellStart"/>
+            <w:r>
+              <w:t>Auth</w:t>
+            </w:r>
+            <w:proofErr w:type="spellEnd"/>
+            <w:r>
+              <w:t>-Service est en ligne</w:t>
             </w:r>
           </w:p>
         </w:tc>
@@ -6498,7 +6821,15 @@
               <w:t>⃣</w:t>
             </w:r>
             <w:r>
-              <w:t xml:space="preserve"> L’utilisateur entre son email et mot de passe2</w:t>
+              <w:t xml:space="preserve"> L’utilisateur entre son </w:t>
+            </w:r>
+            <w:proofErr w:type="gramStart"/>
+            <w:r>
+              <w:t>email</w:t>
+            </w:r>
+            <w:proofErr w:type="gramEnd"/>
+            <w:r>
+              <w:t xml:space="preserve"> et mot de passe2</w:t>
             </w:r>
             <w:r>
               <w:rPr>
@@ -6516,7 +6847,15 @@
               <w:t>️⃣</w:t>
             </w:r>
             <w:r>
-              <w:t xml:space="preserve"> Génération d’un token JWT avec le rôle4</w:t>
+              <w:t xml:space="preserve"> Génération d’un </w:t>
+            </w:r>
+            <w:proofErr w:type="spellStart"/>
+            <w:r>
+              <w:t>token</w:t>
+            </w:r>
+            <w:proofErr w:type="spellEnd"/>
+            <w:r>
+              <w:t xml:space="preserve"> JWT avec le rôle4</w:t>
             </w:r>
             <w:r>
               <w:rPr>
@@ -7126,7 +7465,15 @@
               </w:rPr>
             </w:pPr>
             <w:r>
-              <w:t>TRAIN-01 — Ajout du modèle d’exercices (sets, reps, poids)</w:t>
+              <w:t xml:space="preserve">TRAIN-01 — Ajout du modèle d’exercices (sets, </w:t>
+            </w:r>
+            <w:proofErr w:type="spellStart"/>
+            <w:r>
+              <w:t>reps</w:t>
+            </w:r>
+            <w:proofErr w:type="spellEnd"/>
+            <w:r>
+              <w:t>, poids)</w:t>
             </w:r>
           </w:p>
         </w:tc>
@@ -7462,12 +7809,14 @@
             <w:r>
               <w:t xml:space="preserve">PROG-UPDATE — Mise à jour du JSONB </w:t>
             </w:r>
+            <w:proofErr w:type="spellStart"/>
             <w:r>
               <w:rPr>
                 <w:rStyle w:val="HTMLCode"/>
               </w:rPr>
               <w:t>days</w:t>
             </w:r>
+            <w:proofErr w:type="spellEnd"/>
             <w:r>
               <w:t xml:space="preserve"> (repas + exercices + vidéos + calories)</w:t>
             </w:r>
@@ -7678,13 +8027,23 @@
                 <w:sz w:val="23"/>
               </w:rPr>
             </w:pPr>
+            <w:proofErr w:type="spellStart"/>
             <w:r>
               <w:rPr>
                 <w:rFonts w:ascii="Segoe UI" w:hAnsi="Segoe UI"/>
                 <w:b/>
                 <w:sz w:val="23"/>
               </w:rPr>
-              <w:t>Tracking-Service</w:t>
+              <w:t>Tracking</w:t>
+            </w:r>
+            <w:proofErr w:type="spellEnd"/>
+            <w:r>
+              <w:rPr>
+                <w:rFonts w:ascii="Segoe UI" w:hAnsi="Segoe UI"/>
+                <w:b/>
+                <w:sz w:val="23"/>
+              </w:rPr>
+              <w:t>-Service</w:t>
             </w:r>
           </w:p>
         </w:tc>
@@ -7759,7 +8118,35 @@
                 <w:lang w:val="en-US"/>
               </w:rPr>
               <w:lastRenderedPageBreak/>
-              <w:t>TRACK-01 — Cases repas/exercices + API update tracking</w:t>
+              <w:t xml:space="preserve">TRACK-01 — Cases </w:t>
+            </w:r>
+            <w:proofErr w:type="spellStart"/>
+            <w:r>
+              <w:rPr>
+                <w:lang w:val="en-US"/>
+              </w:rPr>
+              <w:t>repas</w:t>
+            </w:r>
+            <w:proofErr w:type="spellEnd"/>
+            <w:r>
+              <w:rPr>
+                <w:lang w:val="en-US"/>
+              </w:rPr>
+              <w:t>/</w:t>
+            </w:r>
+            <w:proofErr w:type="spellStart"/>
+            <w:r>
+              <w:rPr>
+                <w:lang w:val="en-US"/>
+              </w:rPr>
+              <w:t>exercices</w:t>
+            </w:r>
+            <w:proofErr w:type="spellEnd"/>
+            <w:r>
+              <w:rPr>
+                <w:lang w:val="en-US"/>
+              </w:rPr>
+              <w:t xml:space="preserve"> + API update tracking</w:t>
             </w:r>
           </w:p>
         </w:tc>
@@ -8112,7 +8499,21 @@
               <w:rPr>
                 <w:lang w:val="en-US"/>
               </w:rPr>
-              <w:t>TRACK-DB — Optimisation index tracking (client/day)</w:t>
+              <w:t xml:space="preserve">TRACK-DB — </w:t>
+            </w:r>
+            <w:proofErr w:type="spellStart"/>
+            <w:r>
+              <w:rPr>
+                <w:lang w:val="en-US"/>
+              </w:rPr>
+              <w:t>Optimisation</w:t>
+            </w:r>
+            <w:proofErr w:type="spellEnd"/>
+            <w:r>
+              <w:rPr>
+                <w:lang w:val="en-US"/>
+              </w:rPr>
+              <w:t xml:space="preserve"> index tracking (client/day)</w:t>
             </w:r>
           </w:p>
         </w:tc>
@@ -8384,7 +8785,15 @@
               </w:rPr>
             </w:pPr>
             <w:r>
-              <w:t>COMP-02 — Calcul conformité journalière (synchronisation avec Tracking)</w:t>
+              <w:t xml:space="preserve">COMP-02 — Calcul conformité journalière (synchronisation avec </w:t>
+            </w:r>
+            <w:proofErr w:type="spellStart"/>
+            <w:r>
+              <w:t>Tracking</w:t>
+            </w:r>
+            <w:proofErr w:type="spellEnd"/>
+            <w:r>
+              <w:t>)</w:t>
             </w:r>
           </w:p>
         </w:tc>
@@ -8620,7 +9029,15 @@
               </w:rPr>
             </w:pPr>
             <w:r>
-              <w:t>COMP-API — Endpoints conformité &amp; PDF</w:t>
+              <w:t xml:space="preserve">COMP-API — </w:t>
+            </w:r>
+            <w:proofErr w:type="spellStart"/>
+            <w:r>
+              <w:t>Endpoints</w:t>
+            </w:r>
+            <w:proofErr w:type="spellEnd"/>
+            <w:r>
+              <w:t xml:space="preserve"> conformité &amp; PDF</w:t>
             </w:r>
           </w:p>
         </w:tc>
@@ -8809,7 +9226,15 @@
               <w:spacing w:line="287" w:lineRule="exact"/>
             </w:pPr>
             <w:r>
-              <w:t>UI-04 — Vidéos d’exercices dans dashboard client</w:t>
+              <w:t xml:space="preserve">UI-04 — Vidéos d’exercices dans </w:t>
+            </w:r>
+            <w:proofErr w:type="spellStart"/>
+            <w:r>
+              <w:t>dashboard</w:t>
+            </w:r>
+            <w:proofErr w:type="spellEnd"/>
+            <w:r>
+              <w:t xml:space="preserve"> client</w:t>
             </w:r>
           </w:p>
         </w:tc>
@@ -9251,12 +9676,14 @@
           <w:sz w:val="40"/>
         </w:rPr>
       </w:pPr>
+      <w:proofErr w:type="spellStart"/>
       <w:r>
         <w:rPr>
           <w:sz w:val="40"/>
         </w:rPr>
         <w:t>Signup</w:t>
       </w:r>
+      <w:proofErr w:type="spellEnd"/>
     </w:p>
     <w:p>
       <w:pPr>
@@ -9317,12 +9744,14 @@
           <w:sz w:val="40"/>
         </w:rPr>
       </w:pPr>
+      <w:proofErr w:type="gramStart"/>
       <w:r>
         <w:rPr>
           <w:sz w:val="40"/>
         </w:rPr>
         <w:t>login</w:t>
       </w:r>
+      <w:proofErr w:type="gramEnd"/>
     </w:p>
     <w:p>
       <w:pPr>
@@ -9492,11 +9921,19 @@
           <w:sz w:val="40"/>
         </w:rPr>
       </w:pPr>
+      <w:proofErr w:type="spellStart"/>
       <w:r>
         <w:rPr>
           <w:sz w:val="40"/>
         </w:rPr>
-        <w:t>Creation programme</w:t>
+        <w:t>Creation</w:t>
+      </w:r>
+      <w:proofErr w:type="spellEnd"/>
+      <w:r>
+        <w:rPr>
+          <w:sz w:val="40"/>
+        </w:rPr>
+        <w:t xml:space="preserve"> programme</w:t>
       </w:r>
     </w:p>
     <w:p>

</xml_diff>